<commit_message>
chore: add real contact details to landing footer and sales КП
Co-Authored-By: Claude Opus 4.7 (1M context) <noreply@anthropic.com>
</commit_message>
<xml_diff>
--- a/docs/Bilim_OS_КП.docx
+++ b/docs/Bilim_OS_КП.docx
@@ -521,7 +521,7 @@
         </w:rPr>
         <w:t xml:space="preserve">Демо-доступ: </w:t>
       </w:r>
-      <w:hyperlink w:history="1" r:id="rIdgp3-i--bjiqe2hfubxfp1">
+      <w:hyperlink w:history="1" r:id="rId7gfoan46unvu4720kxgwn">
         <w:r>
           <w:rPr>
             <w:color w:val="E91E8C"/>
@@ -561,7 +561,7 @@
           <w:sz w:val="20"/>
           <w:szCs w:val="20"/>
         </w:rPr>
-        <w:t xml:space="preserve">Контакт: Даткайым Аскарова · [телефон / почта]   ·   Разработано Asystem</w:t>
+        <w:t xml:space="preserve">Контакт: +996 700 144 043 · Asystem@gmail.com   ·   Разработано Asystem</w:t>
       </w:r>
     </w:p>
     <w:sectPr>

</xml_diff>